<commit_message>
chat: fix models & fallback, restore backend call
</commit_message>
<xml_diff>
--- a/VERSEVO_diploma.docx
+++ b/VERSEVO_diploma.docx
@@ -7683,7 +7683,7 @@
           <w:i w:val="0"/>
           <w:sz w:val="24"/>
         </w:rPr>
-        <w:t>Таблица 6 – Тест-кейс 3</w:t>
+        <w:t>Таблица 8 – Тест-кейс 3</w:t>
       </w:r>
     </w:p>
     <w:p>
@@ -11209,7 +11209,7 @@
           <w:i w:val="0"/>
           <w:sz w:val="24"/>
         </w:rPr>
-        <w:t>Таблица 6 – Перечень и расчет объема функций программного средства</w:t>
+        <w:t>Таблица 8 – Перечень и расчет объема функций программного средства</w:t>
       </w:r>
     </w:p>
     <w:p>
@@ -13021,48 +13021,48 @@
           <w:i w:val="0"/>
           <w:sz w:val="28"/>
         </w:rPr>
-        <w:t>В рамках данного дипломного проекта разработано мобильное приложение VERSEVO для интеллектуального чтения и анализа электронных документов. Приложение предназначено для устройств на платформе Android и предоставляет пользователю современные возможности работы с текстовыми документами с применением технологий искусственного интеллекта.</w:t>
-      </w:r>
-    </w:p>
-    <w:p>
-      <w:pPr>
-        <w:spacing w:line="360" w:lineRule="auto" w:after="0" w:before="0"/>
-      </w:pPr>
-      <w:r>
-        <w:rPr>
-          <w:rFonts w:ascii="Times New Roman" w:hAnsi="Times New Roman"/>
-          <w:b w:val="0"/>
-          <w:i w:val="0"/>
-          <w:sz w:val="28"/>
-        </w:rPr>
-      </w:r>
-    </w:p>
-    <w:p>
-      <w:pPr>
-        <w:spacing w:line="360" w:lineRule="auto" w:after="0" w:before="0"/>
-        <w:jc w:val="both"/>
-      </w:pPr>
-      <w:r>
-        <w:rPr>
-          <w:rFonts w:ascii="Times New Roman" w:hAnsi="Times New Roman"/>
-          <w:b w:val="0"/>
-          <w:i w:val="0"/>
-          <w:sz w:val="28"/>
-        </w:rPr>
-        <w:t>В процессе выполнения работы были решены следующие задачи:</w:t>
-      </w:r>
-    </w:p>
-    <w:p>
-      <w:pPr>
-        <w:spacing w:line="360" w:lineRule="auto" w:after="0" w:before="0"/>
-      </w:pPr>
-      <w:r>
-        <w:rPr>
-          <w:rFonts w:ascii="Times New Roman" w:hAnsi="Times New Roman"/>
-          <w:b w:val="0"/>
-          <w:i w:val="0"/>
-          <w:sz w:val="28"/>
-        </w:rPr>
+      </w:r>
+    </w:p>
+    <w:p>
+      <w:pPr>
+        <w:spacing w:line="360" w:lineRule="auto" w:after="0" w:before="0"/>
+      </w:pPr>
+      <w:r>
+        <w:rPr>
+          <w:rFonts w:ascii="Times New Roman" w:hAnsi="Times New Roman"/>
+          <w:b w:val="0"/>
+          <w:i w:val="0"/>
+          <w:sz w:val="28"/>
+        </w:rPr>
+        <w:t>В результате выполнения дипломного проекта была достигнута поставленная цель – разработано мобильное приложение «VERSEVO» для интеллектуального чтения и анализа электронных документов с использованием технологий искусственного интеллекта.</w:t>
+      </w:r>
+    </w:p>
+    <w:p>
+      <w:pPr>
+        <w:spacing w:line="360" w:lineRule="auto" w:after="0" w:before="0"/>
+        <w:jc w:val="both"/>
+      </w:pPr>
+      <w:r>
+        <w:rPr>
+          <w:rFonts w:ascii="Times New Roman" w:hAnsi="Times New Roman"/>
+          <w:b w:val="0"/>
+          <w:i w:val="0"/>
+          <w:sz w:val="28"/>
+        </w:rPr>
+      </w:r>
+    </w:p>
+    <w:p>
+      <w:pPr>
+        <w:spacing w:line="360" w:lineRule="auto" w:after="0" w:before="0"/>
+      </w:pPr>
+      <w:r>
+        <w:rPr>
+          <w:rFonts w:ascii="Times New Roman" w:hAnsi="Times New Roman"/>
+          <w:b w:val="0"/>
+          <w:i w:val="0"/>
+          <w:sz w:val="28"/>
+        </w:rPr>
+        <w:t>В пояснительной записке были описаны следующие этапы проектирования:</w:t>
       </w:r>
     </w:p>
     <w:p>
@@ -13072,22 +13072,25 @@
       <w:r>
         <w:rPr>
           <w:rFonts w:ascii="Times New Roman" w:hAnsi="Times New Roman"/>
+          <w:b w:val="0"/>
           <w:color w:val="000000"/>
-        </w:rPr>
-        <w:t>1. Проведён анализ предметной области и существующих решений для чтения документов. Выявлены недостатки аналогов, обоснована актуальность разработки и выбраны технологии реализации: Flutter для кроссплатформенного клиента, FastAPI для серверной части, PostgreSQL для хранения данных, Hugging Face для AI-функций.</w:t>
-      </w:r>
-    </w:p>
-    <w:p>
-      <w:pPr>
-        <w:spacing w:line="360" w:lineRule="auto" w:after="0" w:before="0"/>
-      </w:pPr>
-      <w:r>
-        <w:rPr>
-          <w:rFonts w:ascii="Times New Roman" w:hAnsi="Times New Roman"/>
-          <w:b w:val="0"/>
-          <w:i w:val="0"/>
-          <w:sz w:val="28"/>
-        </w:rPr>
+          <w:sz w:val="28"/>
+        </w:rPr>
+        <w:t>1 Анализ предметной области и существующих аналогов программных продуктов для чтения и анализа документов;</w:t>
+      </w:r>
+    </w:p>
+    <w:p>
+      <w:pPr>
+        <w:spacing w:line="360" w:lineRule="auto" w:after="0" w:before="0"/>
+      </w:pPr>
+      <w:r>
+        <w:rPr>
+          <w:rFonts w:ascii="Times New Roman" w:hAnsi="Times New Roman"/>
+          <w:b w:val="0"/>
+          <w:i w:val="0"/>
+          <w:sz w:val="28"/>
+        </w:rPr>
+        <w:t>2 Проектирование архитектуры приложения для чтения и анализа электронных документов;</w:t>
       </w:r>
     </w:p>
     <w:p>
@@ -13097,22 +13100,25 @@
       <w:r>
         <w:rPr>
           <w:rFonts w:ascii="Times New Roman" w:hAnsi="Times New Roman"/>
+          <w:b w:val="0"/>
           <w:color w:val="000000"/>
-        </w:rPr>
-        <w:t>2. Спроектирована архитектура приложения, включающая клиентскую часть на Flutter с использованием паттерна BLoC, серверную часть на FastAPI с REST API, базу данных для хранения документов и метаданных. Разработана ER-диаграмма, диаграммы прецедентов, классов, последовательности и компонентов.</w:t>
-      </w:r>
-    </w:p>
-    <w:p>
-      <w:pPr>
-        <w:spacing w:line="360" w:lineRule="auto" w:after="0" w:before="0"/>
-      </w:pPr>
-      <w:r>
-        <w:rPr>
-          <w:rFonts w:ascii="Times New Roman" w:hAnsi="Times New Roman"/>
-          <w:b w:val="0"/>
-          <w:i w:val="0"/>
-          <w:sz w:val="28"/>
-        </w:rPr>
+          <w:sz w:val="28"/>
+        </w:rPr>
+        <w:t>3 Реализация приложения для чтения и анализа электронных документов;</w:t>
+      </w:r>
+    </w:p>
+    <w:p>
+      <w:pPr>
+        <w:spacing w:line="360" w:lineRule="auto" w:after="0" w:before="0"/>
+      </w:pPr>
+      <w:r>
+        <w:rPr>
+          <w:rFonts w:ascii="Times New Roman" w:hAnsi="Times New Roman"/>
+          <w:b w:val="0"/>
+          <w:i w:val="0"/>
+          <w:sz w:val="28"/>
+        </w:rPr>
+        <w:t>4 Тестирование и анализ полученных результатов;</w:t>
       </w:r>
     </w:p>
     <w:p>
@@ -13122,142 +13128,143 @@
       <w:r>
         <w:rPr>
           <w:rFonts w:ascii="Times New Roman" w:hAnsi="Times New Roman"/>
+          <w:b w:val="0"/>
           <w:color w:val="000000"/>
-        </w:rPr>
-        <w:t>3. Реализован функционал приложения:</w:t>
-      </w:r>
-    </w:p>
-    <w:p>
-      <w:pPr>
-        <w:spacing w:line="360" w:lineRule="auto" w:after="0" w:before="0"/>
-        <w:jc w:val="both"/>
-      </w:pPr>
-      <w:r>
-        <w:rPr>
-          <w:rFonts w:ascii="Times New Roman" w:hAnsi="Times New Roman"/>
-          <w:b w:val="0"/>
-          <w:i w:val="0"/>
-          <w:sz w:val="28"/>
-        </w:rPr>
-        <w:t>– авторизация и регистрация пользователей;</w:t>
-      </w:r>
-    </w:p>
-    <w:p>
-      <w:pPr>
-        <w:spacing w:line="360" w:lineRule="auto" w:after="0" w:before="0"/>
-        <w:jc w:val="both"/>
-      </w:pPr>
-      <w:r>
-        <w:rPr>
-          <w:rFonts w:ascii="Times New Roman" w:hAnsi="Times New Roman"/>
-          <w:b w:val="0"/>
-          <w:i w:val="0"/>
-          <w:sz w:val="28"/>
-        </w:rPr>
-        <w:t>– загрузка документов в форматах PDF, DOCX, TXT, EPUB;</w:t>
-      </w:r>
-    </w:p>
-    <w:p>
-      <w:pPr>
-        <w:spacing w:line="360" w:lineRule="auto" w:after="0" w:before="0"/>
-        <w:jc w:val="both"/>
-      </w:pPr>
-      <w:r>
-        <w:rPr>
-          <w:rFonts w:ascii="Times New Roman" w:hAnsi="Times New Roman"/>
-          <w:b w:val="0"/>
-          <w:i w:val="0"/>
-          <w:sz w:val="28"/>
-        </w:rPr>
-        <w:t>– чтение с настройками (шрифт 12–28pt, 5 гарнитур, темы светлая/тёмная/сепия, цвет фона);</w:t>
-      </w:r>
-    </w:p>
-    <w:p>
-      <w:pPr>
-        <w:spacing w:line="360" w:lineRule="auto" w:after="0" w:before="0"/>
-        <w:jc w:val="both"/>
-      </w:pPr>
-      <w:r>
-        <w:rPr>
-          <w:rFonts w:ascii="Times New Roman" w:hAnsi="Times New Roman"/>
-          <w:b w:val="0"/>
-          <w:i w:val="0"/>
-          <w:sz w:val="28"/>
-        </w:rPr>
-        <w:t>– навигация по главам, автоматическое сохранение прогресса;</w:t>
-      </w:r>
-    </w:p>
-    <w:p>
-      <w:pPr>
-        <w:spacing w:line="360" w:lineRule="auto" w:after="0" w:before="0"/>
-        <w:jc w:val="both"/>
-      </w:pPr>
-      <w:r>
-        <w:rPr>
-          <w:rFonts w:ascii="Times New Roman" w:hAnsi="Times New Roman"/>
-          <w:b w:val="0"/>
-          <w:i w:val="0"/>
-          <w:sz w:val="28"/>
-        </w:rPr>
-        <w:t>– создание заметок, выделение текста, работа с цитатами;</w:t>
-      </w:r>
-    </w:p>
-    <w:p>
-      <w:pPr>
-        <w:spacing w:line="360" w:lineRule="auto" w:after="0" w:before="0"/>
-        <w:jc w:val="both"/>
-      </w:pPr>
-      <w:r>
-        <w:rPr>
-          <w:rFonts w:ascii="Times New Roman" w:hAnsi="Times New Roman"/>
-          <w:b w:val="0"/>
-          <w:i w:val="0"/>
-          <w:sz w:val="28"/>
-        </w:rPr>
-        <w:t>– AI-анализ документа (тональность, ключевые темы, именованные сущности, статистика);</w:t>
-      </w:r>
-    </w:p>
-    <w:p>
-      <w:pPr>
-        <w:spacing w:line="360" w:lineRule="auto" w:after="0" w:before="0"/>
-        <w:jc w:val="both"/>
-      </w:pPr>
-      <w:r>
-        <w:rPr>
-          <w:rFonts w:ascii="Times New Roman" w:hAnsi="Times New Roman"/>
-          <w:b w:val="0"/>
-          <w:i w:val="0"/>
-          <w:sz w:val="28"/>
-        </w:rPr>
-        <w:t>– AI-перевод документа с использованием моделей Hugging Face;</w:t>
-      </w:r>
-    </w:p>
-    <w:p>
-      <w:pPr>
-        <w:spacing w:line="360" w:lineRule="auto" w:after="0" w:before="0"/>
-        <w:jc w:val="both"/>
-      </w:pPr>
-      <w:r>
-        <w:rPr>
-          <w:rFonts w:ascii="Times New Roman" w:hAnsi="Times New Roman"/>
-          <w:b w:val="0"/>
-          <w:i w:val="0"/>
-          <w:sz w:val="28"/>
-        </w:rPr>
-        <w:t>– AI-чат по содержанию документа на основе моделей flan-t5.</w:t>
-      </w:r>
-    </w:p>
-    <w:p>
-      <w:pPr>
-        <w:spacing w:line="360" w:lineRule="auto" w:after="0" w:before="0"/>
-      </w:pPr>
-      <w:r>
-        <w:rPr>
-          <w:rFonts w:ascii="Times New Roman" w:hAnsi="Times New Roman"/>
-          <w:b w:val="0"/>
-          <w:i w:val="0"/>
-          <w:sz w:val="28"/>
-        </w:rPr>
+          <w:sz w:val="28"/>
+        </w:rPr>
+        <w:t>5 Разработка руководства по установке и использованию приложения;</w:t>
+      </w:r>
+    </w:p>
+    <w:p>
+      <w:pPr>
+        <w:spacing w:line="360" w:lineRule="auto" w:after="0" w:before="0"/>
+        <w:jc w:val="both"/>
+      </w:pPr>
+      <w:r>
+        <w:rPr>
+          <w:rFonts w:ascii="Times New Roman" w:hAnsi="Times New Roman"/>
+          <w:b w:val="0"/>
+          <w:i w:val="0"/>
+          <w:sz w:val="28"/>
+        </w:rPr>
+        <w:t>6 Расчёт экономического обоснования проекта, стоимости разработки приложения и его рентабельности.</w:t>
+      </w:r>
+    </w:p>
+    <w:p>
+      <w:pPr>
+        <w:spacing w:line="360" w:lineRule="auto" w:after="0" w:before="0"/>
+        <w:jc w:val="both"/>
+      </w:pPr>
+      <w:r>
+        <w:rPr>
+          <w:rFonts w:ascii="Times New Roman" w:hAnsi="Times New Roman"/>
+          <w:b w:val="0"/>
+          <w:i w:val="0"/>
+          <w:sz w:val="28"/>
+        </w:rPr>
+      </w:r>
+    </w:p>
+    <w:p>
+      <w:pPr>
+        <w:spacing w:line="360" w:lineRule="auto" w:after="0" w:before="0"/>
+        <w:jc w:val="both"/>
+      </w:pPr>
+      <w:r>
+        <w:rPr>
+          <w:rFonts w:ascii="Times New Roman" w:hAnsi="Times New Roman"/>
+          <w:b w:val="0"/>
+          <w:i w:val="0"/>
+          <w:sz w:val="28"/>
+        </w:rPr>
+        <w:t>В результате этапа разработки было создано приложение «VERSEVO», состоящее из двух модулей: мобильного клиента и серверной части. Мобильный клиент разработан на языке Dart с использованием фреймворка Flutter, серверная часть – на языке Python с использованием фреймворка FastAPI. Для хранения данных используется СУБД PostgreSQL. Система работает по принципу «клиент-сервер» с взаимодействием через REST API.</w:t>
+      </w:r>
+    </w:p>
+    <w:p>
+      <w:pPr>
+        <w:spacing w:line="360" w:lineRule="auto" w:after="0" w:before="0"/>
+        <w:jc w:val="both"/>
+      </w:pPr>
+      <w:r>
+        <w:rPr>
+          <w:rFonts w:ascii="Times New Roman" w:hAnsi="Times New Roman"/>
+          <w:b w:val="0"/>
+          <w:i w:val="0"/>
+          <w:sz w:val="28"/>
+        </w:rPr>
+      </w:r>
+    </w:p>
+    <w:p>
+      <w:pPr>
+        <w:spacing w:line="360" w:lineRule="auto" w:after="0" w:before="0"/>
+        <w:jc w:val="both"/>
+      </w:pPr>
+      <w:r>
+        <w:rPr>
+          <w:rFonts w:ascii="Times New Roman" w:hAnsi="Times New Roman"/>
+          <w:b w:val="0"/>
+          <w:i w:val="0"/>
+          <w:sz w:val="28"/>
+        </w:rPr>
+        <w:t>В рамках дипломного проекта были решены следующие задачи:</w:t>
+      </w:r>
+    </w:p>
+    <w:p>
+      <w:pPr>
+        <w:spacing w:line="360" w:lineRule="auto" w:after="0" w:before="0"/>
+        <w:jc w:val="both"/>
+      </w:pPr>
+      <w:r>
+        <w:rPr>
+          <w:rFonts w:ascii="Times New Roman" w:hAnsi="Times New Roman"/>
+          <w:b w:val="0"/>
+          <w:i w:val="0"/>
+          <w:sz w:val="28"/>
+        </w:rPr>
+        <w:t>– проанализирована предметная область, выявлены недостатки существующих аналогов и обоснована актуальность разработки;</w:t>
+      </w:r>
+    </w:p>
+    <w:p>
+      <w:pPr>
+        <w:spacing w:line="360" w:lineRule="auto" w:after="0" w:before="0"/>
+        <w:jc w:val="both"/>
+      </w:pPr>
+      <w:r>
+        <w:rPr>
+          <w:rFonts w:ascii="Times New Roman" w:hAnsi="Times New Roman"/>
+          <w:b w:val="0"/>
+          <w:i w:val="0"/>
+          <w:sz w:val="28"/>
+        </w:rPr>
+        <w:t>– спроектирована архитектура системы, разработаны диаграмма вариантов использования, ER-диаграмма базы данных, а также диаграммы классов и последовательности;</w:t>
+      </w:r>
+    </w:p>
+    <w:p>
+      <w:pPr>
+        <w:spacing w:line="360" w:lineRule="auto" w:after="0" w:before="0"/>
+        <w:jc w:val="both"/>
+      </w:pPr>
+      <w:r>
+        <w:rPr>
+          <w:rFonts w:ascii="Times New Roman" w:hAnsi="Times New Roman"/>
+          <w:b w:val="0"/>
+          <w:i w:val="0"/>
+          <w:sz w:val="28"/>
+        </w:rPr>
+        <w:t>– разработана спецификация требований к программному продукту;</w:t>
+      </w:r>
+    </w:p>
+    <w:p>
+      <w:pPr>
+        <w:spacing w:line="360" w:lineRule="auto" w:after="0" w:before="0"/>
+      </w:pPr>
+      <w:r>
+        <w:rPr>
+          <w:rFonts w:ascii="Times New Roman" w:hAnsi="Times New Roman"/>
+          <w:b w:val="0"/>
+          <w:i w:val="0"/>
+          <w:sz w:val="28"/>
+        </w:rPr>
+        <w:t>– разработана клиентская часть на Flutter с использованием паттерна BLoC для управления состоянием;</w:t>
       </w:r>
     </w:p>
     <w:p>
@@ -13267,22 +13274,25 @@
       <w:r>
         <w:rPr>
           <w:rFonts w:ascii="Times New Roman" w:hAnsi="Times New Roman"/>
+          <w:b w:val="0"/>
           <w:color w:val="000000"/>
-        </w:rPr>
-        <w:t>4. Выполнено тестирование приложения: модульное тестирование BLoC и репозиториев, виджет-тестирование экранов. Проведена отладка интеграции с AI-сервисами. Выполнен статический анализ кода (flutter analyze) — ошибок не выявлено.</w:t>
-      </w:r>
-    </w:p>
-    <w:p>
-      <w:pPr>
-        <w:spacing w:line="360" w:lineRule="auto" w:after="0" w:before="0"/>
-      </w:pPr>
-      <w:r>
-        <w:rPr>
-          <w:rFonts w:ascii="Times New Roman" w:hAnsi="Times New Roman"/>
-          <w:b w:val="0"/>
-          <w:i w:val="0"/>
-          <w:sz w:val="28"/>
-        </w:rPr>
+          <w:sz w:val="28"/>
+        </w:rPr>
+        <w:t>– разработана серверная часть на FastAPI с REST API для обработки запросов мобильного клиента;</w:t>
+      </w:r>
+    </w:p>
+    <w:p>
+      <w:pPr>
+        <w:spacing w:line="360" w:lineRule="auto" w:after="0" w:before="0"/>
+      </w:pPr>
+      <w:r>
+        <w:rPr>
+          <w:rFonts w:ascii="Times New Roman" w:hAnsi="Times New Roman"/>
+          <w:b w:val="0"/>
+          <w:i w:val="0"/>
+          <w:sz w:val="28"/>
+        </w:rPr>
+        <w:t>– разработана реляционная база данных PostgreSQL, содержащая 8 таблиц для хранения пользователей, документов, глав, заметок, цитат, закладок, прогресса чтения и кэша переводов;</w:t>
       </w:r>
     </w:p>
     <w:p>
@@ -13292,22 +13302,25 @@
       <w:r>
         <w:rPr>
           <w:rFonts w:ascii="Times New Roman" w:hAnsi="Times New Roman"/>
+          <w:b w:val="0"/>
           <w:color w:val="000000"/>
-        </w:rPr>
-        <w:t>5. Разработано руководство пользователя, описывающее все экраны и сценарии работы с приложением.</w:t>
-      </w:r>
-    </w:p>
-    <w:p>
-      <w:pPr>
-        <w:spacing w:line="360" w:lineRule="auto" w:after="0" w:before="0"/>
-      </w:pPr>
-      <w:r>
-        <w:rPr>
-          <w:rFonts w:ascii="Times New Roman" w:hAnsi="Times New Roman"/>
-          <w:b w:val="0"/>
-          <w:i w:val="0"/>
-          <w:sz w:val="28"/>
-        </w:rPr>
+          <w:sz w:val="28"/>
+        </w:rPr>
+        <w:t>– разработан пользовательский интерфейс с поддержкой настройки параметров чтения (размер шрифта от 12 до 28 pt, 5 гарнитур, светлая/тёмная/сепия темы);</w:t>
+      </w:r>
+    </w:p>
+    <w:p>
+      <w:pPr>
+        <w:spacing w:line="360" w:lineRule="auto" w:after="0" w:before="0"/>
+      </w:pPr>
+      <w:r>
+        <w:rPr>
+          <w:rFonts w:ascii="Times New Roman" w:hAnsi="Times New Roman"/>
+          <w:b w:val="0"/>
+          <w:i w:val="0"/>
+          <w:sz w:val="28"/>
+        </w:rPr>
+        <w:t>– реализован AI-анализ документов с определением тональности, ключевых тем и именованных сущностей с использованием моделей Hugging Face;</w:t>
       </w:r>
     </w:p>
     <w:p>
@@ -13317,50 +13330,492 @@
       <w:r>
         <w:rPr>
           <w:rFonts w:ascii="Times New Roman" w:hAnsi="Times New Roman"/>
+          <w:b w:val="0"/>
           <w:color w:val="000000"/>
-        </w:rPr>
-        <w:t>6. Выполнен экономический расчёт: полная себестоимость разработки составила 21 229,36 руб., рентабельность — 41%, что подтверждает экономическую целесообразность проекта.</w:t>
-      </w:r>
-    </w:p>
-    <w:p>
-      <w:pPr>
-        <w:spacing w:line="360" w:lineRule="auto" w:after="0" w:before="0"/>
-      </w:pPr>
-      <w:r>
-        <w:rPr>
-          <w:rFonts w:ascii="Times New Roman" w:hAnsi="Times New Roman"/>
-          <w:b w:val="0"/>
-          <w:i w:val="0"/>
-          <w:sz w:val="28"/>
-        </w:rPr>
-      </w:r>
-    </w:p>
-    <w:p>
-      <w:pPr>
-        <w:spacing w:line="360" w:lineRule="auto" w:after="0" w:before="0"/>
-        <w:jc w:val="both"/>
-      </w:pPr>
-      <w:r>
-        <w:rPr>
-          <w:rFonts w:ascii="Times New Roman" w:hAnsi="Times New Roman"/>
-          <w:b w:val="0"/>
-          <w:i w:val="0"/>
-          <w:sz w:val="28"/>
-        </w:rPr>
-        <w:t>Все поставленные задачи выполнены в полном объёме. Разработанное приложение VERSEVO может быть использовано как образовательными учреждениями, так и индивидуальными пользователями для работы с электронными документами.</w:t>
-      </w:r>
-    </w:p>
-    <w:p>
-      <w:pPr>
-        <w:spacing w:line="360" w:lineRule="auto" w:after="0" w:before="0"/>
-      </w:pPr>
-      <w:r>
-        <w:rPr>
-          <w:rFonts w:ascii="Times New Roman" w:hAnsi="Times New Roman"/>
-          <w:b w:val="0"/>
-          <w:i w:val="0"/>
-          <w:sz w:val="28"/>
-        </w:rPr>
+          <w:sz w:val="28"/>
+        </w:rPr>
+        <w:t>– реализован AI-перевод документов с использованием Hugging Face Inference API (модели NLLB-200, Helsinki-NLP OPUS-MT);</w:t>
+      </w:r>
+    </w:p>
+    <w:p>
+      <w:pPr>
+        <w:spacing w:line="360" w:lineRule="auto" w:after="0" w:before="0"/>
+      </w:pPr>
+      <w:r>
+        <w:rPr>
+          <w:rFonts w:ascii="Times New Roman" w:hAnsi="Times New Roman"/>
+          <w:b w:val="0"/>
+          <w:i w:val="0"/>
+          <w:sz w:val="28"/>
+        </w:rPr>
+        <w:t>– реализован AI-чат по содержанию документа на основе моделей flan-t5-base и flan-t5-small;</w:t>
+      </w:r>
+    </w:p>
+    <w:p>
+      <w:pPr>
+        <w:spacing w:line="360" w:lineRule="auto" w:after="0" w:before="0"/>
+        <w:jc w:val="both"/>
+      </w:pPr>
+      <w:r>
+        <w:rPr>
+          <w:rFonts w:ascii="Times New Roman" w:hAnsi="Times New Roman"/>
+          <w:b w:val="0"/>
+          <w:i w:val="0"/>
+          <w:sz w:val="28"/>
+        </w:rPr>
+        <w:t>– проведено тестирование приложения путём разработки и выполнения тест-кейсов, проверяющих авторизацию и регистрацию пользователей, загрузку и управление документами, чтение и аннотирование документов, перевод документа на другой язык;</w:t>
+      </w:r>
+    </w:p>
+    <w:p>
+      <w:pPr>
+        <w:spacing w:line="360" w:lineRule="auto" w:after="0" w:before="0"/>
+      </w:pPr>
+      <w:r>
+        <w:rPr>
+          <w:rFonts w:ascii="Times New Roman" w:hAnsi="Times New Roman"/>
+          <w:b w:val="0"/>
+          <w:i w:val="0"/>
+          <w:sz w:val="28"/>
+        </w:rPr>
+        <w:t>– разработано руководство пользователя, описывающее все экраны и сценарии работы с приложением;</w:t>
+      </w:r>
+    </w:p>
+    <w:p>
+      <w:r>
+        <w:rPr>
+          <w:rFonts w:ascii="Times New Roman" w:hAnsi="Times New Roman"/>
+          <w:b w:val="0"/>
+          <w:sz w:val="28"/>
+        </w:rPr>
+        <w:t>– произведён расчёт стоимости разработки приложения и его рентабельности.</w:t>
+        <w:br/>
+        <w:br/>
+        <w:t>Результатом дипломного проектирования является разработанное мобильное приложение «VERSEVO», позволяющее пользователям загружать документы в форматах PDF, DOCX, TXT и EPUB, читать их с индивидуальными настройками отображения, а также выполнять интеллектуальный анализ текста с использованием технологий искусственного интеллекта. Приложение обеспечивает AI-перевод документов, AI-чат для получения ответов по содержанию документа, ведение заметок, цитат и закладок. Учитывая эффективность работы приложения, современность и перспективность выбранных технологий (Flutter, FastAPI, PostgreSQL, Hugging Face) при разработке программного продукта, а также рентабельность разработки, которая составляет 41%, можно с уверенностью сказать, что данный продукт является не только экономически обоснованным и перспективным, но и простым и удобным в использовании.</w:t>
+      </w:r>
+    </w:p>
+    <w:p>
+      <w:pPr>
+        <w:pStyle w:val="Heading1"/>
+      </w:pPr>
+      <w:r>
+        <w:rPr>
+          <w:rFonts w:ascii="Times New Roman" w:hAnsi="Times New Roman"/>
+          <w:color w:val="000000"/>
+        </w:rPr>
+        <w:t>Список использованных источников</w:t>
+      </w:r>
+    </w:p>
+    <w:p>
+      <w:pPr>
+        <w:spacing w:line="360" w:lineRule="auto"/>
+      </w:pPr>
+      <w:r>
+        <w:rPr>
+          <w:rFonts w:ascii="Times New Roman" w:hAnsi="Times New Roman"/>
+          <w:b w:val="0"/>
+          <w:sz w:val="28"/>
+        </w:rPr>
+        <w:t>1. Flutter Documentation [Электронный ресурс]. – Режим доступа: https://docs.flutter.dev/ – Дата доступа: 15.06.2026.</w:t>
+        <w:br/>
+        <w:t>2. Dart Programming Language [Электронный ресурс]. – Режим доступа: https://dart.dev/ – Дата доступа: 15.06.2026.</w:t>
+      </w:r>
+    </w:p>
+    <w:p>
+      <w:pPr>
+        <w:spacing w:line="360" w:lineRule="auto"/>
+      </w:pPr>
+      <w:r>
+        <w:rPr>
+          <w:rFonts w:ascii="Times New Roman" w:hAnsi="Times New Roman"/>
+          <w:b w:val="0"/>
+          <w:sz w:val="28"/>
+        </w:rPr>
+        <w:t>3. FastAPI Documentation [Электронный ресурс]. – Режим доступа: https://fastapi.tiangolo.com/ – Дата доступа: 15.06.2026.</w:t>
+        <w:br/>
+        <w:t>4. Hugging Face Inference API [Электронный ресурс]. – Режим доступа: https://huggingface.co/docs/api-inference/index – Дата доступа: 15.06.2026.</w:t>
+      </w:r>
+    </w:p>
+    <w:p>
+      <w:pPr>
+        <w:spacing w:line="360" w:lineRule="auto"/>
+      </w:pPr>
+      <w:r>
+        <w:rPr>
+          <w:rFonts w:ascii="Times New Roman" w:hAnsi="Times New Roman"/>
+          <w:b w:val="0"/>
+          <w:sz w:val="28"/>
+        </w:rPr>
+        <w:t>5. PostgreSQL Documentation [Электронный ресурс]. – Режим доступа: https://www.postgresql.org/docs/ – Дата доступа: 15.06.2026.</w:t>
+      </w:r>
+    </w:p>
+    <w:p>
+      <w:pPr>
+        <w:spacing w:line="360" w:lineRule="auto"/>
+      </w:pPr>
+      <w:r>
+        <w:rPr>
+          <w:rFonts w:ascii="Times New Roman" w:hAnsi="Times New Roman"/>
+          <w:b w:val="0"/>
+          <w:sz w:val="28"/>
+        </w:rPr>
+        <w:t>6. Dio HTTP Client for Dart [Электронный ресурс]. – Режим доступа: https://pub.dev/packages/dio – Дата доступа: 15.06.2026.</w:t>
+        <w:br/>
+        <w:t>7. BLoC State Management Library [Электронный ресурс]. – Режим доступа: https://bloclibrary.dev/ – Дата доступа: 15.06.2026.</w:t>
+        <w:br/>
+        <w:t>8. PyMuPDF Documentation [Электронный ресурс]. – Режим доступа: https://pymupdf.readthedocs.io/ – Дата доступа: 15.06.2026.</w:t>
+      </w:r>
+    </w:p>
+    <w:p>
+      <w:pPr>
+        <w:spacing w:line="360" w:lineRule="auto"/>
+      </w:pPr>
+      <w:r>
+        <w:rPr>
+          <w:rFonts w:ascii="Times New Roman" w:hAnsi="Times New Roman"/>
+          <w:b w:val="0"/>
+          <w:sz w:val="28"/>
+        </w:rPr>
+        <w:t>9. NLLB-200: A Massively Multilingual Neural Machine Translation Model. – Meta AI, 2022.</w:t>
+        <w:br/>
+        <w:t>10. СТП БГЛК 002-2023. Стандарт предприятия. Дипломное проектирование. – Минск: БГКС, 2023.</w:t>
+      </w:r>
+    </w:p>
+    <w:p>
+      <w:pPr>
+        <w:spacing w:line="360" w:lineRule="auto"/>
+      </w:pPr>
+      <w:r>
+        <w:rPr>
+          <w:rFonts w:ascii="Times New Roman" w:hAnsi="Times New Roman"/>
+          <w:b w:val="0"/>
+          <w:sz w:val="28"/>
+        </w:rPr>
+        <w:t>11. ReadEra — приложение для чтения книг [Электронный ресурс]. – Режим доступа: https://readera.org/ – Дата доступа: 15.06.2026.</w:t>
+      </w:r>
+    </w:p>
+    <w:p>
+      <w:pPr>
+        <w:spacing w:line="360" w:lineRule="auto"/>
+      </w:pPr>
+      <w:r>
+        <w:rPr>
+          <w:rFonts w:ascii="Times New Roman" w:hAnsi="Times New Roman"/>
+          <w:b w:val="0"/>
+          <w:sz w:val="28"/>
+        </w:rPr>
+        <w:t>12. Яндекс Книги [Электронный ресурс]. – Режим доступа: https://books.yandex.ru/ – Дата доступа: 15.06.2026.</w:t>
+      </w:r>
+    </w:p>
+    <w:p>
+      <w:pPr>
+        <w:spacing w:line="360" w:lineRule="auto"/>
+      </w:pPr>
+      <w:r>
+        <w:rPr>
+          <w:rFonts w:ascii="Times New Roman" w:hAnsi="Times New Roman"/>
+          <w:b w:val="0"/>
+          <w:sz w:val="28"/>
+        </w:rPr>
+        <w:t>13. Adobe Scan — сканер документов [Электронный ресурс]. – Режим доступа: https://www.adobe.com/acrobat/mobile/scanner.html – Дата доступа: 15.06.2026.</w:t>
+      </w:r>
+    </w:p>
+    <w:p>
+      <w:pPr>
+        <w:spacing w:line="360" w:lineRule="auto"/>
+      </w:pPr>
+      <w:r>
+        <w:rPr>
+          <w:rFonts w:ascii="Times New Roman" w:hAnsi="Times New Roman"/>
+          <w:b w:val="0"/>
+          <w:sz w:val="28"/>
+        </w:rPr>
+        <w:t>14. eReader Prestigio [Электронный ресурс]. – Режим доступа: https://ereader.prestigio.com/ – Дата доступа: 15.06.2026.</w:t>
+      </w:r>
+    </w:p>
+    <w:p>
+      <w:pPr>
+        <w:spacing w:line="360" w:lineRule="auto"/>
+      </w:pPr>
+      <w:r>
+        <w:rPr>
+          <w:rFonts w:ascii="Times New Roman" w:hAnsi="Times New Roman"/>
+          <w:b w:val="0"/>
+          <w:sz w:val="28"/>
+        </w:rPr>
+        <w:t>15. FBReader — электронная библиотека [Электронный ресурс]. – Режим доступа: https://fbreader.org/ – Дата доступа: 15.06.2026.</w:t>
+      </w:r>
+    </w:p>
+    <w:p>
+      <w:r>
+        <w:rPr>
+          <w:rFonts w:ascii="Times New Roman" w:hAnsi="Times New Roman"/>
+          <w:b w:val="0"/>
+          <w:sz w:val="28"/>
+        </w:rPr>
+        <w:t>16. Google Sign-In for Flutter [Электронный ресурс]. – Режим доступа: https://pub.dev/packages/google_sign_in – Дата доступа: 15.06.2026.</w:t>
+        <w:br/>
+        <w:t>17. Google Fonts for Flutter [Электронный ресурс]. – Режим доступа: https://pub.dev/packages/google_fonts – Дата доступа: 15.06.2026.</w:t>
+        <w:br/>
+        <w:t>18. Shared Preferences Flutter Package [Электронный ресурс]. – Режим доступа: https://pub.dev/packages/shared_preferences – Дата доступа: 15.06.2026.</w:t>
+      </w:r>
+    </w:p>
+    <w:p>
+      <w:pPr>
+        <w:pStyle w:val="Heading1"/>
+      </w:pPr>
+      <w:r>
+        <w:rPr>
+          <w:rFonts w:ascii="Times New Roman" w:hAnsi="Times New Roman"/>
+          <w:color w:val="000000"/>
+        </w:rPr>
+        <w:t>Приложение А</w:t>
+      </w:r>
+    </w:p>
+    <w:p>
+      <w:pPr>
+        <w:spacing w:line="360" w:lineRule="auto" w:after="0" w:before="0"/>
+        <w:jc w:val="center"/>
+      </w:pPr>
+      <w:r>
+        <w:rPr>
+          <w:rFonts w:ascii="Times New Roman" w:hAnsi="Times New Roman"/>
+          <w:b w:val="0"/>
+          <w:i w:val="0"/>
+          <w:sz w:val="28"/>
+        </w:rPr>
+        <w:t>Техническое задание на разработку мобильного приложения «VERSEVO»</w:t>
+        <w:br/>
+        <w:br/>
+        <w:t>А.1 Наименование и область применения</w:t>
+        <w:br/>
+        <w:br/>
+        <w:t>Наименование программного средства: мобильное приложение «VERSEVO» для чтения и анализа электронных документов с использованием технологий искусственного интеллекта.</w:t>
+        <w:br/>
+        <w:br/>
+        <w:t>Область применения: сфера информационных технологий, электронное образование, работа с текстовыми документами. Приложение предназначено для использования студентами, преподавателями, исследователями и специалистами, работающими с большими объёмами текстовой информации (PDF, DOCX, TXT, EPUB), с целью чтения, анализа, перевода и структурирования содержимого документов с применением AI-функций.</w:t>
+        <w:br/>
+        <w:br/>
+        <w:t>А.2 Основание для разработки</w:t>
+        <w:br/>
+        <w:br/>
+        <w:t>Основанием для разработки технического задания являются ГОСТ 19.201-78 «Техническое задание. Требования к содержанию и оформлению», а также выполнение задания для дипломного проектирования.</w:t>
+        <w:br/>
+        <w:br/>
+        <w:t>А.3 Назначение разработки</w:t>
+        <w:br/>
+        <w:br/>
+        <w:t>Программное средство предназначено для создания единого инструмента работы с электронными документами, обеспечивающего загрузку, чтение, интеллектуальный анализ и перевод текстов. Целью является автоматизация процессов работы с документами, предоставление пользователю AI-ассистента для анализа содержания, обеспечение многофункционального интерфейса чтения с индивидуальными настройками, а также интеграция с облачным бэкендом для синхронизации данных.</w:t>
+        <w:br/>
+        <w:br/>
+        <w:t>А.4 Технические требования к программе</w:t>
+        <w:br/>
+        <w:br/>
+        <w:t>А.4.1 Требования к программному продукту</w:t>
+        <w:br/>
+        <w:br/>
+        <w:t>Разработанная в процессе дипломного проектирования программа должна выполнять следующие функции:</w:t>
+        <w:br/>
+        <w:br/>
+        <w:t>1 Управление пользователями и аутентификация:</w:t>
+        <w:br/>
+        <w:t>– регистрация новых пользователей с указанием email, имени и пароля;</w:t>
+        <w:br/>
+        <w:t>– авторизация зарегистрированных пользователей по email и паролю;</w:t>
+        <w:br/>
+        <w:t>– вход через Google-аккаунт (Google Sign-In) с верификацией id_token на сервере;</w:t>
+        <w:br/>
+        <w:t>– сохранение пользовательской сессии с использованием JWT-токена;</w:t>
+        <w:br/>
+        <w:t>– просмотр профиля авторизованного пользователя;</w:t>
+        <w:br/>
+        <w:t>– выход из системы с очисткой локальных данных.</w:t>
+        <w:br/>
+        <w:br/>
+        <w:t>2 Управление документами:</w:t>
+        <w:br/>
+        <w:t>– загрузка документов в форматах PDF, DOCX, TXT, EPUB через интерфейс приложения;</w:t>
+        <w:br/>
+        <w:t>– поддержка загрузки как через выбор файла, так и через base64 API;</w:t>
+        <w:br/>
+        <w:t>– автоматическое извлечение текстового содержимого из загруженных файлов;</w:t>
+        <w:br/>
+        <w:t>– определение структуры документа с автоматическим выделением глав;</w:t>
+        <w:br/>
+        <w:t>– определение языка документа (русский / английский) на основе анализа текста;</w:t>
+        <w:br/>
+        <w:t>– отображение списка загруженных документов с метаинформацией (объём, язык, дата);</w:t>
+        <w:br/>
+        <w:t>– удаление документа из библиотеки;</w:t>
+        <w:br/>
+        <w:t>– хранение документов на сервере с синхронизацией между устройствами.</w:t>
+        <w:br/>
+        <w:br/>
+        <w:t>3 Чтение и настройка отображения:</w:t>
+        <w:br/>
+        <w:t>– полноэкранное чтение документа с навигацией по страницам / главам;</w:t>
+        <w:br/>
+        <w:t>– настройка размера шрифта от 12 до 28 pt;</w:t>
+        <w:br/>
+        <w:t>– выбор гарнитуры шрифта (5 вариантов: Inter, Roboto, Playfair Display, Cormorant Garamond, PT Serif);</w:t>
+        <w:br/>
+        <w:t>– переключение тем оформления: светлая, тёмная, сепия;</w:t>
+        <w:br/>
+        <w:t>– настройка цвета фона;</w:t>
+        <w:br/>
+        <w:t>– регулировка межстрочного интервала (стандартный, свободный, широкий);</w:t>
+        <w:br/>
+        <w:t>– автоматическое сохранение прогресса чтения;</w:t>
+        <w:br/>
+        <w:t>– навигация по главам документа;</w:t>
+        <w:br/>
+        <w:t>– отображение статистики чтения (прогресс, время чтения).</w:t>
+        <w:br/>
+        <w:br/>
+        <w:t>4 Заметки, цитаты и закладки:</w:t>
+        <w:br/>
+        <w:t>– создание заметок к выделенному тексту с указанием цвета;</w:t>
+        <w:br/>
+        <w:t>– сохранение цитат из текста документа;</w:t>
+        <w:br/>
+        <w:t>– создание закладок для быстрого перехода к определённому месту;</w:t>
+        <w:br/>
+        <w:t>– просмотр и управление списком заметок, цитат и закладок;</w:t>
+        <w:br/>
+        <w:t>– синхронизация заметок, цитат и закладок между устройствами через облачный бэкенд.</w:t>
+        <w:br/>
+        <w:br/>
+        <w:t>5 AI-анализ документа:</w:t>
+        <w:br/>
+        <w:t>– анализ тональности текста с использованием модели rubert-base-cased-sentiment;</w:t>
+        <w:br/>
+        <w:t>– выделение ключевых тем и именованных сущностей (NER) с использованием модели wikineural-multilingual-ner;</w:t>
+        <w:br/>
+        <w:t>– расчёт статистики текста (количество слов, предложений, абзацев, время чтения);</w:t>
+        <w:br/>
+        <w:t>– определение сложности текста;</w:t>
+        <w:br/>
+        <w:t>– генерация краткого содержания документа;</w:t>
+        <w:br/>
+        <w:t>– определение языка и стилистических особенностей;</w:t>
+        <w:br/>
+        <w:t>– три режима анализа: быстрый, стандартный, детальный.</w:t>
+        <w:br/>
+        <w:br/>
+        <w:t>6 AI-перевод документа:</w:t>
+        <w:br/>
+        <w:t>– перевод текста документа между русским и английским языками;</w:t>
+        <w:br/>
+        <w:t>– использование Hugging Face Inference API (NLLB-200, Helsinki-NLP OPUS-MT);</w:t>
+        <w:br/>
+        <w:t>– локальный словарный перевод как fallback-режим;</w:t>
+        <w:br/>
+        <w:t>– поддержание стиля перевода (художественный / информационный).</w:t>
+        <w:br/>
+        <w:br/>
+        <w:t>7 AI-чат по документу:</w:t>
+        <w:br/>
+        <w:t>– задавание вопросов по содержанию документа на естественном языке;</w:t>
+        <w:br/>
+        <w:t>– генерация ответов с использованием моделей flan-t5-base, flan-t5-small;</w:t>
+        <w:br/>
+        <w:t>– поддержка специальных запросов: статистика, поиск по тексту, краткое содержание;</w:t>
+        <w:br/>
+        <w:t>– анализ тональности по запросу пользователя;</w:t>
+        <w:br/>
+        <w:t>– fallback-режим с шаблонными ответами при недоступности AI-моделей.</w:t>
+        <w:br/>
+        <w:br/>
+        <w:t>8 Интеграция с облачным бэкендом:</w:t>
+        <w:br/>
+        <w:t>– REST API на базе FastAPI;</w:t>
+        <w:br/>
+        <w:t>– хранение данных в PostgreSQL (8 таблиц);</w:t>
+        <w:br/>
+        <w:t>– синхронизация документов, заметок, цитат, закладок и прогресса чтения;</w:t>
+        <w:br/>
+        <w:t>– in-memory кэш для ускорения доступа к документам;</w:t>
+        <w:br/>
+        <w:t>– развёртывание на платформе Railway.</w:t>
+        <w:br/>
+        <w:br/>
+        <w:t>А.4.2 Требования к надёжности</w:t>
+        <w:br/>
+        <w:br/>
+        <w:t>Приложение должно обеспечивать устойчивую работу при одновременном доступе нескольких пользователей. Серверная часть должна корректно обрабатывать исключительные ситуации (ошибки базы данных, некорректный ввод, отсутствие файлов) с выводом информативных диагностических сообщений. Все запросы к защищённым маршрутам API должны проходить проверку авторизации на сервере. Данные, передаваемые через формы, должны проходить валидацию на стороне клиента и сервера. Загрузка файлов должна ограничиваться допустимыми типами (PDF, DOCX, TXT, EPUB) и размером (не более 50 MB). При недоступности AI-сервисов Hugging Face должен обеспечиваться fallback-режим с локальными алгоритмами анализа.</w:t>
+        <w:br/>
+        <w:br/>
+        <w:t>А.4.3 Условия эксплуатации</w:t>
+        <w:br/>
+        <w:br/>
+        <w:t>Доступ к приложению осуществляется через мобильное устройство на платформе Android без установки дополнительного программного обеспечения. Минимальная скорость интернет-соединения: 1 Мбит/с (для синхронизации с бэкендом и AI-функций). Квалификация пользователя: специальных технических навыков не требуется; управление приложением доступно через интуитивно понятный интерфейс на русском языке.</w:t>
+        <w:br/>
+        <w:br/>
+        <w:t>А.4.4 Требования к составу и параметрам технических средств</w:t>
+        <w:br/>
+        <w:br/>
+        <w:t>Клиентское устройство: смартфон или планшет на платформе Android 8.0 (API 26) или выше, с объёмом оперативной памяти не менее 3 ГБ, процессором с тактовой частотой не менее 1.8 ГГц, разрешением экрана по ширине от 360 пикселей. Серверная часть: среда выполнения Python 3.10 или выше, фреймворк FastAPI, СУБД PostgreSQL 14 или выше, платформа развёртывания Railway.</w:t>
+        <w:br/>
+        <w:br/>
+        <w:t>А.4.5 Требования к информационной и программной совместимости</w:t>
+        <w:br/>
+        <w:br/>
+        <w:t>Система должна базироваться на следующем стеке технологий: Flutter 3.x (фреймворк мобильной разработки), Dart 3.x (язык клиентской разработки), FastAPI (фреймворк серверной разработки на Python), PostgreSQL (реляционная база данных), Hugging Face Inference API (AI-сервисы), Docker (контейнеризация серверной части). Клиентская часть должна корректно функционировать на устройствах с Android 8.0 и выше.</w:t>
+        <w:br/>
+        <w:br/>
+        <w:t>А.4.6 Требования к маркировке и упаковке</w:t>
+        <w:br/>
+        <w:br/>
+        <w:t>Не предоставляются.</w:t>
+        <w:br/>
+        <w:br/>
+        <w:t>А.4.7 Требования к транспортировке и хранению</w:t>
+        <w:br/>
+        <w:br/>
+        <w:t>Не предоставляются.</w:t>
+        <w:br/>
+        <w:br/>
+        <w:t>А.4.8 Специальные требования</w:t>
+        <w:br/>
+        <w:br/>
+        <w:t>– поддержка адаптивного интерфейса для мобильных устройств с шириной экрана от 360 пикселей;</w:t>
+        <w:br/>
+        <w:t>– поддержка русского и английского интерфейса;</w:t>
+        <w:br/>
+        <w:t>– поддержка кириллического и латинского ввода;</w:t>
+        <w:br/>
+        <w:t>– обеспечение конфиденциальности данных пользователей при передаче через HTTPS;</w:t>
+        <w:br/>
+        <w:t>– соответствие требованиям законодательства о защите персональных данных.</w:t>
+        <w:br/>
+        <w:br/>
+        <w:t>А.5 Стадии и этапы разработки</w:t>
+        <w:br/>
+        <w:br/>
+        <w:t>Разработка мобильного приложения VERSEVO осуществляется в четыре этапа:</w:t>
+        <w:br/>
+        <w:br/>
+        <w:t>– разработка технического задания;</w:t>
+        <w:br/>
+        <w:t>– эскизный проект;</w:t>
+        <w:br/>
+        <w:t>– технический проект;</w:t>
+        <w:br/>
+        <w:t>– рабочий проект.</w:t>
+        <w:br/>
+        <w:br/>
+        <w:t>На стадии эскизного проекта разрабатывается общее описание логики системы, реляционная схема базы данных PostgreSQL и модели данных для хранения пользователей, документов, глав, заметок, цитат, закладок, прогресса чтения и кэша переводов. Описывается клиент-серверная архитектура приложения, взаимодействие между Flutter-клиентом и FastAPI-сервером через REST API. Разрабатывается ролевая модель доступа и план мероприятий по реализации AI-функций.</w:t>
+        <w:br/>
+        <w:br/>
+        <w:t>Стадия «Технический проект» содержит детально проработанную архитектуру маршрутизации (экраны приложения, API-эндпоинты), систему управления состоянием на основе BLoC и описание API-интерфейсов для всех модулей приложения. Здесь же проектируются механизмы аутентификации на основе JWT-токенов, логика работы AI-сервисов и схема интеграции с Hugging Face Inference API. Разрабатываются механизмы валидации входящих данных, загрузки файлов и обработки исключительных ситуаций.</w:t>
+        <w:br/>
+        <w:br/>
+        <w:t>На стадии рабочего проекта осуществляется непосредственное программирование и отладка приложения. Реализуются Flutter-экраны и BLoC-компоненты, серверные обработчики FastAPI, интеграция с PostgreSQL и Hugging Face. Проводится разработка программных документов, методики испытаний и подготовка контрольно-отладочных примеров. Окончательно оформляется графический материал (схемы архитектуры, скриншоты интерфейса). Сборка APK и развёртывание серверной части на Railway.</w:t>
+        <w:br/>
+        <w:br/>
+        <w:t>А.6 Порядок контроля и приёмки</w:t>
+        <w:br/>
+        <w:br/>
+        <w:t>Контроль и приёмка разработки осуществляются на основе испытаний контрольно-отладочных примеров. При этом проверяется выполнение всех функций программы: корректность работы аутентификации (включая Google Sign-In), загрузка и чтение документов всех поддерживаемых форматов, работа AI-анализа, AI-перевода и AI-чата, создание и синхронизация заметок, цитат и закладок, а также адаптивность интерфейса на устройствах с различным разрешением экрана.</w:t>
       </w:r>
     </w:p>
     <w:p>
@@ -13377,127 +13832,55 @@
           <w:rFonts w:ascii="Times New Roman" w:hAnsi="Times New Roman"/>
           <w:color w:val="000000"/>
         </w:rPr>
-        <w:t>Список использованных источников</w:t>
-      </w:r>
-    </w:p>
-    <w:p>
-      <w:pPr>
-        <w:spacing w:line="360" w:lineRule="auto"/>
-      </w:pPr>
-      <w:r>
-        <w:rPr>
-          <w:rFonts w:ascii="Times New Roman" w:hAnsi="Times New Roman"/>
-          <w:sz w:val="28"/>
-        </w:rPr>
-        <w:t>1. Flutter Documentation [Электронный ресурс]. – Режим доступа: https://docs.flutter.dev/</w:t>
-      </w:r>
-    </w:p>
-    <w:p>
-      <w:pPr>
-        <w:spacing w:line="360" w:lineRule="auto"/>
-      </w:pPr>
-      <w:r>
-        <w:rPr>
-          <w:rFonts w:ascii="Times New Roman" w:hAnsi="Times New Roman"/>
-          <w:sz w:val="28"/>
-        </w:rPr>
-        <w:t>2. FastAPI Documentation [Электронный ресурс]. – Режим доступа: https://fastapi.tiangolo.com/</w:t>
-      </w:r>
-    </w:p>
-    <w:p>
-      <w:pPr>
-        <w:spacing w:line="360" w:lineRule="auto"/>
-      </w:pPr>
-      <w:r>
-        <w:rPr>
-          <w:rFonts w:ascii="Times New Roman" w:hAnsi="Times New Roman"/>
-          <w:sz w:val="28"/>
-        </w:rPr>
-        <w:t>3. Hugging Face Inference API [Электронный ресурс]. – Режим доступа: https://huggingface.co/docs/api-inference/index</w:t>
-      </w:r>
-    </w:p>
-    <w:p>
-      <w:pPr>
-        <w:spacing w:line="360" w:lineRule="auto"/>
-      </w:pPr>
-      <w:r>
-        <w:rPr>
-          <w:rFonts w:ascii="Times New Roman" w:hAnsi="Times New Roman"/>
-          <w:sz w:val="28"/>
-        </w:rPr>
-        <w:t>4. Dart Programming Language [Электронный ресурс]. – Режим доступа: https://dart.dev/</w:t>
-      </w:r>
-    </w:p>
-    <w:p>
-      <w:pPr>
-        <w:spacing w:line="360" w:lineRule="auto"/>
-      </w:pPr>
-      <w:r>
-        <w:rPr>
-          <w:rFonts w:ascii="Times New Roman" w:hAnsi="Times New Roman"/>
-          <w:sz w:val="28"/>
-        </w:rPr>
-        <w:t>5. PostgreSQL Documentation [Электронный ресурс]. – Режим доступа: https://www.postgresql.org/docs/</w:t>
-      </w:r>
-    </w:p>
-    <w:p>
-      <w:pPr>
-        <w:spacing w:line="360" w:lineRule="auto"/>
-      </w:pPr>
-      <w:r>
-        <w:rPr>
-          <w:rFonts w:ascii="Times New Roman" w:hAnsi="Times New Roman"/>
-          <w:sz w:val="28"/>
-        </w:rPr>
-        <w:t>6. Dio HTTP Client [Электронный ресурс]. – Режим доступа: https://pub.dev/packages/dio</w:t>
-      </w:r>
-    </w:p>
-    <w:p>
-      <w:pPr>
-        <w:spacing w:line="360" w:lineRule="auto"/>
-      </w:pPr>
-      <w:r>
-        <w:rPr>
-          <w:rFonts w:ascii="Times New Roman" w:hAnsi="Times New Roman"/>
-          <w:sz w:val="28"/>
-        </w:rPr>
-        <w:t>7. BLoC State Management [Электронный ресурс]. – Режим доступа: https://bloclibrary.dev/</w:t>
-      </w:r>
-    </w:p>
-    <w:p>
-      <w:pPr>
-        <w:spacing w:line="360" w:lineRule="auto"/>
-      </w:pPr>
-      <w:r>
-        <w:rPr>
-          <w:rFonts w:ascii="Times New Roman" w:hAnsi="Times New Roman"/>
-          <w:sz w:val="28"/>
-        </w:rPr>
-        <w:t>8. PyMuPDF Documentation [Электронный ресурс]. – Режим доступа: https://pymupdf.readthedocs.io/</w:t>
-      </w:r>
-    </w:p>
-    <w:p>
-      <w:pPr>
-        <w:spacing w:line="360" w:lineRule="auto"/>
-      </w:pPr>
-      <w:r>
-        <w:rPr>
-          <w:rFonts w:ascii="Times New Roman" w:hAnsi="Times New Roman"/>
-          <w:sz w:val="28"/>
-        </w:rPr>
-        <w:t>9. СТП БГЛК 002-2023. Стандарт предприятия. Дипломное проектирование. – Минск: БГКС, 2023.</w:t>
-      </w:r>
-    </w:p>
-    <w:p>
-      <w:pPr>
-        <w:spacing w:line="360" w:lineRule="auto"/>
-      </w:pPr>
-      <w:r>
-        <w:rPr>
-          <w:rFonts w:ascii="Times New Roman" w:hAnsi="Times New Roman"/>
-          <w:sz w:val="28"/>
-        </w:rPr>
-        <w:t>10. NLLB-200: A Massively Multilingual Neural Machine Translation Model. – Meta AI, 2022.</w:t>
+        <w:t>Приложение Б</w:t>
+      </w:r>
+    </w:p>
+    <w:p>
+      <w:pPr>
+        <w:spacing w:line="360" w:lineRule="auto" w:after="0" w:before="0"/>
+        <w:jc w:val="center"/>
+      </w:pPr>
+      <w:r>
+        <w:rPr>
+          <w:rFonts w:ascii="Times New Roman" w:hAnsi="Times New Roman"/>
+          <w:b w:val="0"/>
+          <w:i w:val="0"/>
+          <w:sz w:val="28"/>
+        </w:rPr>
+        <w:t>Внешний вид основных экранов системы</w:t>
+        <w:br/>
+        <w:br/>
+        <w:t>На рисунках Б.1–Б.10 представлены основные экраны мобильного приложения VERSEVO.</w:t>
+        <w:br/>
+        <w:br/>
+        <w:t>Рисунок Б.1 – Экран входа в систему (LoginScreen)</w:t>
+        <w:br/>
+        <w:br/>
+        <w:t>Рисунок Б.2 – Экран регистрации (RegisterScreen)</w:t>
+        <w:br/>
+        <w:br/>
+        <w:t>Рисунок Б.3 – Главный экран с библиотекой документов (HomeScreen / LibraryScreen)</w:t>
+        <w:br/>
+        <w:br/>
+        <w:t>Рисунок Б.4 – Экран загрузки документа (DocumentUploadScreen)</w:t>
+        <w:br/>
+        <w:br/>
+        <w:t>Рисунок Б.5 – Экран читалки с открытым документом (DocumentReaderScreen)</w:t>
+        <w:br/>
+        <w:br/>
+        <w:t>Рисунок Б.6 – Панель настроек чтения (шрифт, размер, тема)</w:t>
+        <w:br/>
+        <w:br/>
+        <w:t>Рисунок Б.7 – Экран AI-анализа документа (AnalysisScreen)</w:t>
+        <w:br/>
+        <w:br/>
+        <w:t>Рисунок Б.8 – Экран AI-чата по документу (AiChatScreen)</w:t>
+        <w:br/>
+        <w:br/>
+        <w:t>Рисунок Б.9 – Экран заметок и цитат</w:t>
+        <w:br/>
+        <w:br/>
+        <w:t>Рисунок Б.10 – Экран отчётов (ReportsScreen)</w:t>
       </w:r>
     </w:p>
     <w:p>
@@ -13514,7 +13897,7 @@
           <w:rFonts w:ascii="Times New Roman" w:hAnsi="Times New Roman"/>
           <w:color w:val="000000"/>
         </w:rPr>
-        <w:t>Приложение А</w:t>
+        <w:t>Приложение В</w:t>
       </w:r>
     </w:p>
     <w:p>
@@ -13525,75 +13908,32 @@
       <w:r>
         <w:rPr>
           <w:rFonts w:ascii="Times New Roman" w:hAnsi="Times New Roman"/>
-          <w:b/>
-          <w:i w:val="0"/>
-          <w:sz w:val="28"/>
-        </w:rPr>
-        <w:t>Техническое задание на разработку мобильного приложения «VERSEVO»</w:t>
-      </w:r>
-    </w:p>
-    <w:p>
-      <w:r>
-        <w:br w:type="page"/>
-      </w:r>
-    </w:p>
-    <w:p>
-      <w:pPr>
-        <w:pStyle w:val="Heading1"/>
-      </w:pPr>
-      <w:r>
-        <w:rPr>
-          <w:rFonts w:ascii="Times New Roman" w:hAnsi="Times New Roman"/>
-          <w:color w:val="000000"/>
-        </w:rPr>
-        <w:t>Приложение Б</w:t>
-      </w:r>
-    </w:p>
-    <w:p>
-      <w:pPr>
-        <w:spacing w:line="360" w:lineRule="auto" w:after="0" w:before="0"/>
-        <w:jc w:val="center"/>
-      </w:pPr>
-      <w:r>
-        <w:rPr>
-          <w:rFonts w:ascii="Times New Roman" w:hAnsi="Times New Roman"/>
-          <w:b/>
-          <w:i w:val="0"/>
-          <w:sz w:val="28"/>
-        </w:rPr>
-        <w:t>Внешний вид основных экранов системы</w:t>
-      </w:r>
-    </w:p>
-    <w:p>
-      <w:r>
-        <w:br w:type="page"/>
-      </w:r>
-    </w:p>
-    <w:p>
-      <w:pPr>
-        <w:pStyle w:val="Heading1"/>
-      </w:pPr>
-      <w:r>
-        <w:rPr>
-          <w:rFonts w:ascii="Times New Roman" w:hAnsi="Times New Roman"/>
-          <w:color w:val="000000"/>
-        </w:rPr>
-        <w:t>Приложение В</w:t>
-      </w:r>
-    </w:p>
-    <w:p>
-      <w:pPr>
-        <w:spacing w:line="360" w:lineRule="auto" w:after="0" w:before="0"/>
-        <w:jc w:val="center"/>
-      </w:pPr>
-      <w:r>
-        <w:rPr>
-          <w:rFonts w:ascii="Times New Roman" w:hAnsi="Times New Roman"/>
-          <w:b/>
+          <w:b w:val="0"/>
           <w:i w:val="0"/>
           <w:sz w:val="28"/>
         </w:rPr>
         <w:t>Листинги программного кода</w:t>
+        <w:br/>
+        <w:br/>
+        <w:t>Листинг В.1 – Основной файл серверной части (main.py) – FastAPI-приложение с эндпоинтами для загрузки документов, аутентификации, AI-анализа, AI-перевода и AI-чата.</w:t>
+        <w:br/>
+        <w:br/>
+        <w:t>Листинг В.2 – AuthApi (auth_api.dart) – реализация API-вызовов для регистрации, входа и Google-аутентификации.</w:t>
+        <w:br/>
+        <w:br/>
+        <w:t>Листинг В.3 – AuthBloc (auth_bloc.dart) – управление состоянием аутентификации с использованием паттерна BLoC.</w:t>
+        <w:br/>
+        <w:br/>
+        <w:t>Листинг В.4 – DocumentBloc – управление состоянием списка документов (загрузка, удаление, синхронизация).</w:t>
+        <w:br/>
+        <w:br/>
+        <w:t>Листинг В.5 – DocumentReaderScreen – экран читалки с настройками отображения и навигацией по главам.</w:t>
+        <w:br/>
+        <w:br/>
+        <w:t>Листинг В.6 – AiChatScreen – экран AI-чата с интеграцией Hugging Face Inference API.</w:t>
+        <w:br/>
+        <w:br/>
+        <w:t>Примечание: полные листинги исходного кода приведены в электронном виде на прилагаемом носителе.</w:t>
       </w:r>
     </w:p>
     <w:sectPr>

</xml_diff>